<commit_message>
Update LOR drafts (.docx + .md) to concise (~260 words) universal/passe-partout format
Co-authored-by: arena-agent <297053741+arena-agent@users.noreply.github.com>
</commit_message>
<xml_diff>
--- a/candidatures/Lettre_Recommandation_Calvin_MINANG_Prof_Dhafer_SAIDANE_EN.docx
+++ b/candidatures/Lettre_Recommandation_Calvin_MINANG_Prof_Dhafer_SAIDANE_EN.docx
@@ -4,13 +4,13 @@
   <w:body>
     <w:p>
       <w:pPr>
-        <w:spacing w:after="240"/>
+        <w:spacing w:after="280"/>
       </w:pPr>
       <w:r>
         <w:rPr>
           <w:b/>
           <w:color w:val="1F4E78"/>
-          <w:sz w:val="23"/>
+          <w:sz w:val="24"/>
         </w:rPr>
         <w:t>Prof. Dhafer SAIDANE</w:t>
         <w:br/>
@@ -27,7 +27,7 @@
     </w:p>
     <w:p>
       <w:pPr>
-        <w:spacing w:after="240"/>
+        <w:spacing w:after="280"/>
         <w:jc w:val="right"/>
       </w:pPr>
       <w:r>
@@ -36,18 +36,18 @@
     </w:p>
     <w:p>
       <w:pPr>
-        <w:spacing w:after="200"/>
+        <w:spacing w:after="240"/>
       </w:pPr>
       <w:r>
         <w:rPr>
           <w:b/>
         </w:rPr>
-        <w:t>Subject: Letter of Recommendation for Mr. Calvin MINANG — Front Office (FX Sales &amp; Trading / Global Markets)</w:t>
+        <w:t>Subject: Letter of Recommendation for Mr. Calvin MINANG</w:t>
       </w:r>
     </w:p>
     <w:p>
       <w:pPr>
-        <w:spacing w:after="160"/>
+        <w:spacing w:after="200"/>
       </w:pPr>
       <w:r>
         <w:t>To Whom It May Concern,</w:t>
@@ -55,61 +55,52 @@
     </w:p>
     <w:p>
       <w:pPr>
-        <w:spacing w:after="140" w:line="269" w:lineRule="auto"/>
+        <w:spacing w:after="180" w:line="276" w:lineRule="auto"/>
         <w:jc w:val="both"/>
       </w:pPr>
       <w:r>
-        <w:t>In my capacity as Full Professor of Finance and Programme Director of the MSc in Corporate Financial Management at SKEMA Business School (Lille Campus), I am writing to give my highest and most enthusiastic recommendation for Mr. Calvin Minang for a Front Office position in Foreign Exchange (FX) Sales &amp; Trading, Derivatives, or Market Risk.</w:t>
+        <w:t>In my capacity as Full Professor of Finance and Programme Director of the MSc in Corporate Financial Management at SKEMA Business School, I am delighted to write this letter of strong recommendation for Mr. Calvin Minang.</w:t>
       </w:r>
     </w:p>
     <w:p>
       <w:pPr>
-        <w:spacing w:after="140" w:line="269" w:lineRule="auto"/>
+        <w:spacing w:after="180" w:line="276" w:lineRule="auto"/>
         <w:jc w:val="both"/>
       </w:pPr>
       <w:r>
-        <w:t>I have had the pleasure of teaching Calvin in our core market finance module, "Money, Banking and Financial Markets", as well as in the "Fundamentals of Banking, Financial &amp; Extra-Financial Risks" seminar. I also work closely with him in his elected role as Class Representative (Délégué) for the MSc cohort. Coming from an intensive French preparatory class background (CPGE ECE at IPESUP Paris) and pursuing the selective dual track combining SKEMA’s Master in Management (Grande École) and the MSc Corporate Financial Management, Calvin ranks among the most technically gifted and market-driven students in our programme.</w:t>
+        <w:t>I have had the pleasure of teaching Calvin in our core module "Money, Banking and Financial Markets" as well as in the "Fundamentals of Banking &amp; Financial Risks" seminar, and I work closely with him in his elected role as Class Representative (Délégué) for the M2 cohort. Building on a rigorous mathematical and economic background in French preparatory classes (CPGE at IPESUP Paris) and pursuing the dual Master in Management (Grande École) and MSc track, Calvin ranks among the most analytically gifted and driven students in our programme.</w:t>
       </w:r>
     </w:p>
     <w:p>
       <w:pPr>
-        <w:spacing w:after="140" w:line="269" w:lineRule="auto"/>
+        <w:spacing w:after="180" w:line="276" w:lineRule="auto"/>
         <w:jc w:val="both"/>
       </w:pPr>
       <w:r>
-        <w:t>What sets Calvin apart in classroom discussions and practical market exercises is that he already thinks and operates like a Front Office practitioner. Throughout my course—which covers foreign exchange markets (spot, forwards, swaps), money market instruments and repo operations, fixed income pricing (duration and convexity), futures cash-and-carry arbitrage, and options pricing and Greeks—Calvin has consistently shown a deep, intuitive grasp of how macroeconomic catalysts, central bank monetary policy, and liquidity conditions translate into desk-level pricing and client hedging strategies. His intellectual curiosity goes well beyond syllabus requirements, as reflected both in his rapid personal mastery of the reference literature on international money and FX markets and in our exchanges regarding his research interest in AI-driven FX portfolio management and banking stability.</w:t>
+        <w:t>Academically and technically, Calvin stands out for his quantitative rigor and his ability to connect theory to real-world financial problems. Across fixed income, foreign exchange, money markets, derivatives pricing (options, Greeks, and structured products), and risk management, he demonstrates sharp mathematical intuition and genuine intellectual curiosity—consistently going well beyond syllabus requirements in both his independent reading and his quantitative modeling in Python and VBA. He is currently developing research under my guidance on quantitative and AI-driven approaches to portfolio and risk management.</w:t>
       </w:r>
     </w:p>
     <w:p>
       <w:pPr>
-        <w:spacing w:after="140" w:line="269" w:lineRule="auto"/>
+        <w:spacing w:after="180" w:line="276" w:lineRule="auto"/>
         <w:jc w:val="both"/>
       </w:pPr>
       <w:r>
-        <w:t>Calvin pairs this academic excellence with strong hands-on technical execution. Following his experience as a Multi-Asset Reporting Analyst at BPCE Assurances in Paris—where he monitored FX majors, interest rate swap curves, credit spreads, and equity indices using Bloomberg (BQL) and automated workflows via Excel/VBA—he independently built three impressive quantitative tools: a cross-asset trading desk dashboard tracking FX, volatility, and Risk-On/Risk-Off regimes (CalvinX Market Terminal), a Python/SQL machine-learning portfolio stress-testing engine for geopolitical and macro shocks (ShockLab), and a Black-Scholes-Merton options and Greeks pricer modeling short-gamma tail risk. Combined with his preparation for the GARP FRM and AMF certifications, this gives him immediate operational readiness on a trading floor.</w:t>
+        <w:t>Beyond his technical abilities, Calvin possesses remarkable personal and leadership qualities. As an elected Class Representative for an international cohort, he is a reliable, articulate, and constructive intermediary between students and faculty. He works with maturity, composure under pressure, and a strong team spirit.</w:t>
       </w:r>
     </w:p>
     <w:p>
       <w:pPr>
-        <w:spacing w:after="140" w:line="269" w:lineRule="auto"/>
+        <w:spacing w:after="180" w:line="276" w:lineRule="auto"/>
         <w:jc w:val="both"/>
       </w:pPr>
       <w:r>
-        <w:t>Finally, on a personal level, Calvin possesses the exact temperament required to succeed in Sales &amp; Trading. As an elected Class Representative for an international M2 cohort, he acts as a trusted, constructive bridge between students and faculty. He is articulate in both English and French, proactive, resilient under pressure, and combines quantitative rigor with genuine commercial flair.</w:t>
+        <w:t>I therefore recommend Mr. Calvin Minang without reservation, whether for a demanding position in financial markets, structuring, quantitative finance, or investment banking, or for admission to a selective academic or engineering programme. Please feel free to contact me should you require any further information.</w:t>
       </w:r>
     </w:p>
     <w:p>
       <w:pPr>
-        <w:spacing w:after="140" w:line="269" w:lineRule="auto"/>
-        <w:jc w:val="both"/>
-      </w:pPr>
-      <w:r>
-        <w:t>I therefore recommend Mr. Calvin Minang without reservation for a Front Office role within your Global Markets division. Please feel free to contact me directly should you require any additional information.</w:t>
-      </w:r>
-    </w:p>
-    <w:p>
-      <w:pPr>
-        <w:spacing w:before="200"/>
+        <w:spacing w:before="240"/>
       </w:pPr>
       <w:r>
         <w:t>Sincerely,</w:t>
@@ -136,7 +127,7 @@
     </w:p>
     <w:sectPr>
       <w:pgSz w:w="12240" w:h="15840"/>
-      <w:pgMar w:top="1224" w:right="1368" w:bottom="1224" w:left="1368" w:header="720" w:footer="720" w:gutter="0"/>
+      <w:pgMar w:top="1440" w:right="1440" w:bottom="1440" w:left="1440" w:header="720" w:footer="720" w:gutter="0"/>
       <w:cols w:space="720"/>
       <w:docGrid w:linePitch="360"/>
     </w:sectPr>
@@ -509,7 +500,7 @@
     <w:rsid w:val="00FC693F"/>
     <w:rPr>
       <w:rFonts w:ascii="Calibri" w:hAnsi="Calibri"/>
-      <w:sz w:val="21"/>
+      <w:sz w:val="22"/>
     </w:rPr>
   </w:style>
   <w:style w:type="paragraph" w:styleId="Header">

</xml_diff>

<commit_message>
Update EN Letter of Recommendation .docx with exact approved 1-page English text
Co-authored-by: arena-agent <297053741+arena-agent@users.noreply.github.com>
</commit_message>
<xml_diff>
--- a/candidatures/Lettre_Recommandation_Calvin_MINANG_Prof_Dhafer_SAIDANE_EN.docx
+++ b/candidatures/Lettre_Recommandation_Calvin_MINANG_Prof_Dhafer_SAIDANE_EN.docx
@@ -4,34 +4,15 @@
   <w:body>
     <w:p>
       <w:pPr>
-        <w:spacing w:after="280"/>
+        <w:spacing w:after="360"/>
+        <w:jc w:val="center"/>
       </w:pPr>
       <w:r>
         <w:rPr>
           <w:b/>
-          <w:color w:val="1F4E78"/>
-          <w:sz w:val="24"/>
+          <w:sz w:val="26"/>
         </w:rPr>
-        <w:t>Prof. Dhafer SAIDANE</w:t>
-        <w:br/>
-      </w:r>
-      <w:r>
-        <w:t>Full Professor of Finance — Ph.D. in Economics, HDR (Université Paris 1 Panthéon-Sorbonne)</w:t>
-        <w:br/>
-        <w:t>Programme Director, MSc Corporate Financial Management (Lille Campus)</w:t>
-        <w:br/>
-        <w:t>SKEMA Business School — Avenue Willy Brandt, 59777 Lille, France</w:t>
-        <w:br/>
-        <w:t>Email: dhafer.saidane@skema.edu</w:t>
-      </w:r>
-    </w:p>
-    <w:p>
-      <w:pPr>
-        <w:spacing w:after="280"/>
-        <w:jc w:val="right"/>
-      </w:pPr>
-      <w:r>
-        <w:t>Lille, October 19, 2026</w:t>
+        <w:t>LETTER OF RECOMMENDATION</w:t>
       </w:r>
     </w:p>
     <w:p>
@@ -39,71 +20,87 @@
         <w:spacing w:after="240"/>
       </w:pPr>
       <w:r>
-        <w:rPr>
-          <w:b/>
-        </w:rPr>
-        <w:t>Subject: Letter of Recommendation for Mr. Calvin MINANG</w:t>
-      </w:r>
-    </w:p>
-    <w:p>
-      <w:pPr>
-        <w:spacing w:after="200"/>
-      </w:pPr>
-      <w:r>
         <w:t>To Whom It May Concern,</w:t>
       </w:r>
     </w:p>
     <w:p>
       <w:pPr>
-        <w:spacing w:after="180" w:line="276" w:lineRule="auto"/>
+        <w:spacing w:after="200" w:line="276" w:lineRule="auto"/>
         <w:jc w:val="both"/>
       </w:pPr>
       <w:r>
-        <w:t>In my capacity as Full Professor of Finance and Programme Director of the MSc in Corporate Financial Management at SKEMA Business School, I am delighted to write this letter of strong recommendation for Mr. Calvin Minang.</w:t>
+        <w:t>As Professor of Finance and Director of the MSc Corporate Financial Management at SKEMA Business School, I am pleased to recommend Mr. Calvin Minang.</w:t>
       </w:r>
     </w:p>
     <w:p>
       <w:pPr>
-        <w:spacing w:after="180" w:line="276" w:lineRule="auto"/>
+        <w:spacing w:after="200" w:line="276" w:lineRule="auto"/>
         <w:jc w:val="both"/>
       </w:pPr>
       <w:r>
-        <w:t>I have had the pleasure of teaching Calvin in our core module "Money, Banking and Financial Markets" as well as in the "Fundamentals of Banking &amp; Financial Risks" seminar, and I work closely with him in his elected role as Class Representative (Délégué) for the M2 cohort. Building on a rigorous mathematical and economic background in French preparatory classes (CPGE at IPESUP Paris) and pursuing the dual Master in Management (Grande École) and MSc track, Calvin ranks among the most analytically gifted and driven students in our programme.</w:t>
+        <w:t>I taught Calvin in the course Money, Banking and Financial Markets and interacted regularly with him through his role as elected Class Representative of the MSc CFM cohort.</w:t>
       </w:r>
     </w:p>
     <w:p>
       <w:pPr>
-        <w:spacing w:after="180" w:line="276" w:lineRule="auto"/>
+        <w:spacing w:after="200" w:line="276" w:lineRule="auto"/>
         <w:jc w:val="both"/>
       </w:pPr>
       <w:r>
-        <w:t>Academically and technically, Calvin stands out for his quantitative rigor and his ability to connect theory to real-world financial problems. Across fixed income, foreign exchange, money markets, derivatives pricing (options, Greeks, and structured products), and risk management, he demonstrates sharp mathematical intuition and genuine intellectual curiosity—consistently going well beyond syllabus requirements in both his independent reading and his quantitative modeling in Python and VBA. He is currently developing research under my guidance on quantitative and AI-driven approaches to portfolio and risk management.</w:t>
+        <w:t>Throughout the semester, Calvin demonstrated a strong interest in banking, financial markets and foreign exchange markets. He actively contributed to classroom discussions on topics including banking regulation, financial risks, sustainable finance and the role of financial institutions in the economy. His participation reflected curiosity, critical thinking and a genuine interest in financial market dynamics.</w:t>
       </w:r>
     </w:p>
     <w:p>
       <w:pPr>
-        <w:spacing w:after="180" w:line="276" w:lineRule="auto"/>
+        <w:spacing w:after="200" w:line="276" w:lineRule="auto"/>
         <w:jc w:val="both"/>
       </w:pPr>
       <w:r>
-        <w:t>Beyond his technical abilities, Calvin possesses remarkable personal and leadership qualities. As an elected Class Representative for an international cohort, he is a reliable, articulate, and constructive intermediary between students and faculty. He works with maturity, composure under pressure, and a strong team spirit.</w:t>
+        <w:t>In both group projects and class presentations, Calvin displayed solid analytical and communication skills, with the ability to synthesize and explain complex financial concepts effectively.</w:t>
       </w:r>
     </w:p>
     <w:p>
       <w:pPr>
-        <w:spacing w:after="180" w:line="276" w:lineRule="auto"/>
+        <w:spacing w:after="200" w:line="276" w:lineRule="auto"/>
         <w:jc w:val="both"/>
       </w:pPr>
       <w:r>
-        <w:t>I therefore recommend Mr. Calvin Minang without reservation, whether for a demanding position in financial markets, structuring, quantitative finance, or investment banking, or for admission to a selective academic or engineering programme. Please feel free to contact me should you require any further information.</w:t>
+        <w:t>As Class Representative, he carried out his responsibilities with professionalism, reliability and commitment, serving as a constructive liaison between students and faculty.</w:t>
       </w:r>
     </w:p>
     <w:p>
       <w:pPr>
-        <w:spacing w:before="240"/>
+        <w:spacing w:after="200" w:line="276" w:lineRule="auto"/>
+        <w:jc w:val="both"/>
       </w:pPr>
       <w:r>
-        <w:t>Sincerely,</w:t>
+        <w:t>Our discussions also highlighted his particular interest in foreign exchange markets and international finance, which he intends to further explore during his upcoming academic exchange semester in Brazil and through his future Master's thesis.</w:t>
+      </w:r>
+    </w:p>
+    <w:p>
+      <w:pPr>
+        <w:spacing w:after="200" w:line="276" w:lineRule="auto"/>
+        <w:jc w:val="both"/>
+      </w:pPr>
+      <w:r>
+        <w:t>Based on my observations, I am confident that Calvin possesses the analytical, interpersonal and professional qualities required to succeed in demanding academic and professional environments, particularly within financial markets and Front Office functions.</w:t>
+      </w:r>
+    </w:p>
+    <w:p>
+      <w:pPr>
+        <w:spacing w:after="200" w:line="276" w:lineRule="auto"/>
+        <w:jc w:val="both"/>
+      </w:pPr>
+      <w:r>
+        <w:t>I recommend him with confidence.</w:t>
+      </w:r>
+    </w:p>
+    <w:p>
+      <w:pPr>
+        <w:spacing w:before="320" w:line="276" w:lineRule="auto"/>
+      </w:pPr>
+      <w:r>
+        <w:t>Yours sincerely,</w:t>
         <w:br/>
         <w:br/>
         <w:br/>
@@ -112,17 +109,15 @@
         <w:rPr>
           <w:b/>
         </w:rPr>
-        <w:t>Prof. Dhafer SAIDANE</w:t>
+        <w:t>Prof. Dhafer Saidane</w:t>
         <w:br/>
       </w:r>
       <w:r>
-        <w:t>Full Professor of Finance (Ph.D., HDR Paris 1 Panthéon-Sorbonne)</w:t>
+        <w:t>Professor of Finance</w:t>
         <w:br/>
-        <w:t>Programme Director — MSc Corporate Financial Management</w:t>
+        <w:t>Director, MSc Corporate Financial Management</w:t>
         <w:br/>
         <w:t>SKEMA Business School</w:t>
-        <w:br/>
-        <w:t>dhafer.saidane@skema.edu</w:t>
       </w:r>
     </w:p>
     <w:sectPr>

</xml_diff>

<commit_message>
Apply Copilot optimizations + fix past Brazil semester (Spring 2026) in final .docx LOR
Co-authored-by: arena-agent <297053741+arena-agent@users.noreply.github.com>
</commit_message>
<xml_diff>
--- a/candidatures/Lettre_Recommandation_Calvin_MINANG_Prof_Dhafer_SAIDANE_EN.docx
+++ b/candidatures/Lettre_Recommandation_Calvin_MINANG_Prof_Dhafer_SAIDANE_EN.docx
@@ -47,7 +47,7 @@
         <w:jc w:val="both"/>
       </w:pPr>
       <w:r>
-        <w:t>Throughout the semester, Calvin demonstrated a strong interest in banking, financial markets and foreign exchange markets. He actively contributed to classroom discussions on topics including banking regulation, financial risks, sustainable finance and the role of financial institutions in the economy. His participation reflected curiosity, critical thinking and a genuine interest in financial market dynamics.</w:t>
+        <w:t>Throughout the semester, Calvin demonstrated a strong interest in banking, financial markets and foreign exchange markets. He actively contributed to classroom discussions on topics including banking regulation, financial risks, sustainable finance, foreign exchange markets and the role of financial institutions in the economy. His participation reflected curiosity, critical thinking and a genuine interest in financial market dynamics.</w:t>
       </w:r>
     </w:p>
     <w:p>
@@ -74,7 +74,7 @@
         <w:jc w:val="both"/>
       </w:pPr>
       <w:r>
-        <w:t>Our discussions also highlighted his particular interest in foreign exchange markets and international finance, which he intends to further explore during his upcoming academic exchange semester in Brazil and through his future Master's thesis.</w:t>
+        <w:t>Our discussions also highlighted his particular interest in foreign exchange markets and international finance, which was further enriched by his international academic semester in Brazil and which he intends to explore in depth through his Master's thesis.</w:t>
       </w:r>
     </w:p>
     <w:p>
@@ -83,7 +83,7 @@
         <w:jc w:val="both"/>
       </w:pPr>
       <w:r>
-        <w:t>Based on my observations, I am confident that Calvin possesses the analytical, interpersonal and professional qualities required to succeed in demanding academic and professional environments, particularly within financial markets and Front Office functions.</w:t>
+        <w:t>Based on my observations, I am confident that Calvin possesses the analytical, interpersonal and professional qualities required to succeed in demanding academic and professional environments, particularly within financial markets, sales &amp; trading and Front Office functions.</w:t>
       </w:r>
     </w:p>
     <w:p>

</xml_diff>